<commit_message>
Rebuild three blueprints with distinct theses, frameworks, references and structure
Co-Authored-By: Claude Sonnet 5.5 <noreply@anthropic.com>
Claude-Session: https://claude.ai/code/session_0111sQgAXXkFSZgwaRVLyatu
</commit_message>
<xml_diff>
--- a/Starbucks_Bangladesh_Blueprint.docx
+++ b/Starbucks_Bangladesh_Blueprint.docx
@@ -410,7 +410,7 @@
                 <w:sz w:val="19"/>
                 <w:szCs w:val="19"/>
               </w:rPr>
-              <w:t xml:space="preserve">RBV (Barney, 1991) with core competence (Prahalad and Hamel, 1990), benchmarked against named rivals instead of in isolation.</w:t>
+              <w:t xml:space="preserve">Dynamic capabilities (Teece, 2007: sensing, seizing, transforming), benchmarked against named rivals instead of tested in isolation.</w:t>
             </w:r>
           </w:p>
         </w:tc>
@@ -473,7 +473,7 @@
                 <w:sz w:val="19"/>
                 <w:szCs w:val="19"/>
               </w:rPr>
-              <w:t xml:space="preserve">Eclectic Paradigm (market-seeking); institutional voids (Khanna and Palepu, 1997) with Scott’s three pillars; liability of outsidership (Johanson and Vahlne, 2009).</w:t>
+              <w:t xml:space="preserve">Eclectic Paradigm (market-seeking, equity JV logic); institutional voids (Khanna and Palepu, 1997); social embeddedness of business networks (Granovetter, 1985); late-mover logic (Lieberman and Montgomery, 1988).</w:t>
             </w:r>
           </w:p>
         </w:tc>
@@ -662,7 +662,7 @@
                 <w:sz w:val="19"/>
                 <w:szCs w:val="19"/>
               </w:rPr>
-              <w:t xml:space="preserve">Intro 50 | AC1 430 | AC2 430 | Conclusion 50 = 960 (40-word margin).</w:t>
+              <w:t xml:space="preserve">Intro 50 | AC1 440 | AC2 430 | Conclusion 50 = 970 (30-word margin).</w:t>
             </w:r>
           </w:p>
         </w:tc>
@@ -860,7 +860,7 @@
                 <w:sz w:val="19"/>
                 <w:szCs w:val="19"/>
               </w:rPr>
-              <w:t xml:space="preserve">“Detailed and deeply integrated” AC1 discussion; RBV, Institutional Theory, Eclectic Paradigm all applied</w:t>
+              <w:t xml:space="preserve">“Detailed and deeply integrated” AC1 discussion; resource-based, Institutional and Eclectic ideas all applied</w:t>
             </w:r>
           </w:p>
         </w:tc>
@@ -889,7 +889,7 @@
                 <w:sz w:val="19"/>
                 <w:szCs w:val="19"/>
               </w:rPr>
-              <w:t xml:space="preserve">Each theory has one job and hands over to the next: RBV says what Starbucks has, OLI says why Bangladesh, institutional theory says through whom.</w:t>
+              <w:t xml:space="preserve">Each theory has one job and hands over to the next: dynamic capabilities (the resource-based family) says what Starbucks can adapt, OLI says why Bangladesh, institutional voids and embeddedness say through whom.</w:t>
             </w:r>
           </w:p>
         </w:tc>
@@ -1201,7 +1201,7 @@
           <w:sz w:val="21"/>
           <w:szCs w:val="21"/>
         </w:rPr>
-        <w:t xml:space="preserve">Using RBV or VRIO as a generic table with no competitor comparison.</w:t>
+        <w:t xml:space="preserve">Using a generic capability list with no competitor comparison, or confusing static resources with dynamic capabilities.</w:t>
       </w:r>
     </w:p>
     <w:p>
@@ -1990,7 +1990,7 @@
                 <w:sz w:val="19"/>
                 <w:szCs w:val="19"/>
               </w:rPr>
-              <w:t xml:space="preserve">RBV (Barney, 1991) with core competence (Prahalad and Hamel, 1990): the ONE internal framework</w:t>
+              <w:t xml:space="preserve">Dynamic capabilities (Teece, 2007), a resource-based extension: the ONE internal framework</w:t>
             </w:r>
           </w:p>
         </w:tc>
@@ -2019,7 +2019,7 @@
                 <w:sz w:val="19"/>
                 <w:szCs w:val="19"/>
               </w:rPr>
-              <w:t xml:space="preserve">Which resources and competences matter, benchmarked against four named rivals</w:t>
+              <w:t xml:space="preserve">Can Starbucks sense local taste shifts, seize them through a partner, and transform its model? Benchmarked against four named rivals</w:t>
             </w:r>
           </w:p>
         </w:tc>
@@ -2048,7 +2048,7 @@
                 <w:sz w:val="19"/>
                 <w:szCs w:val="19"/>
               </w:rPr>
-              <w:t xml:space="preserve">Static; benchmarks depend on thin public rival data; a resource is only valuable if local customers value it</w:t>
+              <w:t xml:space="preserve">Hard to observe from outside; risks becoming a vague label; benchmarks depend on thin rival data</w:t>
             </w:r>
           </w:p>
         </w:tc>
@@ -2266,7 +2266,7 @@
                 <w:sz w:val="19"/>
                 <w:szCs w:val="19"/>
               </w:rPr>
-              <w:t xml:space="preserve">Institutional voids (Khanna and Palepu, 1997) with Scott’s regulative, normative and cognitive pillars</w:t>
+              <w:t xml:space="preserve">Institutional voids (Khanna and Palepu, 1997)</w:t>
             </w:r>
           </w:p>
         </w:tc>
@@ -2358,7 +2358,7 @@
                 <w:sz w:val="19"/>
                 <w:szCs w:val="19"/>
               </w:rPr>
-              <w:t xml:space="preserve">Liability of outsidership (Johanson and Vahlne, 2009)</w:t>
+              <w:t xml:space="preserve">Embeddedness (Granovetter, 1985)</w:t>
             </w:r>
           </w:p>
         </w:tc>
@@ -2387,7 +2387,7 @@
                 <w:sz w:val="19"/>
                 <w:szCs w:val="19"/>
               </w:rPr>
-              <w:t xml:space="preserve">Why network access, not just distance, shapes success</w:t>
+              <w:t xml:space="preserve">Why trusted relationships and conglomerate networks shape who gets permits, sites and staff</w:t>
             </w:r>
           </w:p>
         </w:tc>
@@ -2416,7 +2416,7 @@
                 <w:sz w:val="19"/>
                 <w:szCs w:val="19"/>
               </w:rPr>
-              <w:t xml:space="preserve">Hard to measure; may over-weight relationships vs formal contracts</w:t>
+              <w:t xml:space="preserve">Hard to measure; may over-weight relationships relative to formal contracts</w:t>
             </w:r>
           </w:p>
         </w:tc>
@@ -2547,7 +2547,7 @@
           <w:sz w:val="30"/>
           <w:szCs w:val="30"/>
         </w:rPr>
-        <w:t xml:space="preserve">6. Section plan: paragraph cards (960 words)</w:t>
+        <w:t xml:space="preserve">6. Section plan: paragraph cards (970 words)</w:t>
       </w:r>
     </w:p>
     <w:tbl>
@@ -2815,7 +2815,7 @@
                 <w:sz w:val="19"/>
                 <w:szCs w:val="19"/>
               </w:rPr>
-              <w:t xml:space="preserve">430</w:t>
+              <w:t xml:space="preserve">440</w:t>
             </w:r>
           </w:p>
         </w:tc>
@@ -2844,7 +2844,7 @@
                 <w:sz w:val="19"/>
                 <w:szCs w:val="19"/>
               </w:rPr>
-              <w:t xml:space="preserve">1a 80 + 1b 170 + 1c 180</w:t>
+              <w:t xml:space="preserve">1a 80 + 1b 170 + 1c 190</w:t>
             </w:r>
           </w:p>
         </w:tc>
@@ -3091,7 +3091,7 @@
                 <w:sz w:val="19"/>
                 <w:szCs w:val="19"/>
               </w:rPr>
-              <w:t xml:space="preserve">960</w:t>
+              <w:t xml:space="preserve">970</w:t>
             </w:r>
           </w:p>
         </w:tc>
@@ -3120,7 +3120,7 @@
                 <w:sz w:val="19"/>
                 <w:szCs w:val="19"/>
               </w:rPr>
-              <w:t xml:space="preserve">Keep a 40-word margin; check what counts under your word-count guidelines.</w:t>
+              <w:t xml:space="preserve">Keep a 30-word margin; check what counts under your word-count guidelines.</w:t>
             </w:r>
           </w:p>
         </w:tc>
@@ -3376,7 +3376,7 @@
           <w:sz w:val="24"/>
           <w:szCs w:val="24"/>
         </w:rPr>
-        <w:t xml:space="preserve">AC1: Competitive Advantage (430 words)</w:t>
+        <w:t xml:space="preserve">AC1: Competitive Advantage (440 words)</w:t>
       </w:r>
     </w:p>
     <w:p>
@@ -3812,7 +3812,7 @@
           <w:sz w:val="22"/>
           <w:szCs w:val="22"/>
         </w:rPr>
-        <w:t xml:space="preserve">Card 1b. RBV benchmarked against named rivals (170 words)</w:t>
+        <w:t xml:space="preserve">Card 1b. Dynamic capabilities benchmarked against named rivals (170 words)</w:t>
       </w:r>
     </w:p>
     <w:tbl>
@@ -3956,7 +3956,7 @@
                 <w:sz w:val="19"/>
                 <w:szCs w:val="19"/>
               </w:rPr>
-              <w:t xml:space="preserve">Starbucks’ advantage is a bundle of competences rivals find hard to match together: global sourcing standards and scale, training and store-operations systems, brand equity among travelled and diaspora consumers, and a digital loyalty platform.</w:t>
+              <w:t xml:space="preserve">Starbucks’ advantage is not a fixed asset list but the ability to sense, seize and transform: read local taste (tea, flavours), mobilise a partner and sites quickly, and adapt menu, pricing and operations. Underlying assets: global sourcing standards, training systems, brand equity among travelled and diaspora consumers, a digital loyalty platform.</w:t>
             </w:r>
           </w:p>
         </w:tc>
@@ -4082,7 +4082,7 @@
                 <w:sz w:val="19"/>
                 <w:szCs w:val="19"/>
               </w:rPr>
-              <w:t xml:space="preserve">RBV (valuable, rare, hard to imitate) plus core competence: Prahalad and Hamel (1990).</w:t>
+              <w:t xml:space="preserve">Dynamic capabilities (Teece, 2007): sensing, seizing, transforming.</w:t>
             </w:r>
           </w:p>
         </w:tc>
@@ -4145,7 +4145,7 @@
                 <w:sz w:val="19"/>
                 <w:szCs w:val="19"/>
               </w:rPr>
-              <w:t xml:space="preserve">Check “valuable” through local eyes: premium pricing may not be valued; Café Amazon’s conglomerate backing and 100-store plan shows rivals can scale fast; imported-bean duties hit everyone.</w:t>
+              <w:t xml:space="preserve">Check each capability through local eyes: premium pricing may not be valued; capabilities are hard to see from outside, so state what evidence you actually have; Café Amazon’s conglomerate backing and 100-store plan shows rivals can scale fast; imported-bean duties hit everyone.</w:t>
             </w:r>
           </w:p>
         </w:tc>
@@ -4232,7 +4232,7 @@
           <w:sz w:val="22"/>
           <w:szCs w:val="22"/>
         </w:rPr>
-        <w:t xml:space="preserve">Card 1c. Why enter, and through whom (180 words)</w:t>
+        <w:t xml:space="preserve">Card 1c. Why enter, and through whom (190 words)</w:t>
       </w:r>
     </w:p>
     <w:tbl>
@@ -4502,7 +4502,7 @@
                 <w:sz w:val="19"/>
                 <w:szCs w:val="19"/>
               </w:rPr>
-              <w:t xml:space="preserve">Eclectic Paradigm; institutional voids (Khanna and Palepu, 1997); liability of outsidership (Johanson and Vahlne, 2009).</w:t>
+              <w:t xml:space="preserve">Eclectic Paradigm (Dunning, 1988); institutional voids (Khanna and Palepu, 1997); embeddedness (Granovetter, 1985).</w:t>
             </w:r>
           </w:p>
         </w:tc>
@@ -6073,7 +6073,7 @@
                 <w:sz w:val="19"/>
                 <w:szCs w:val="19"/>
               </w:rPr>
-              <w:t xml:space="preserve">Transferable to Pakistan, Sri Lanka and other South Asian markets; one sentence on dynamic capabilities (Teece et al., 1997) if space allows.</w:t>
+              <w:t xml:space="preserve">Transferable to Pakistan, Sri Lanka and other South Asian markets; show that “transforming” the model is itself the learning.</w:t>
             </w:r>
           </w:p>
         </w:tc>
@@ -10026,7 +10026,7 @@
           <w:sz w:val="21"/>
           <w:szCs w:val="21"/>
         </w:rPr>
-        <w:t xml:space="preserve">Barney, J. (1991) ‘Firm resources and sustained competitive advantage’, Journal of Management, 17(1).</w:t>
+        <w:t xml:space="preserve">Dunning, J.H. (1988) ‘The eclectic paradigm of international production’, Journal of International Business Studies, 19(1).</w:t>
       </w:r>
     </w:p>
     <w:p>
@@ -10044,7 +10044,7 @@
           <w:sz w:val="21"/>
           <w:szCs w:val="21"/>
         </w:rPr>
-        <w:t xml:space="preserve">Dunning, J.H. (1988) ‘The eclectic paradigm of international production’, Journal of International Business Studies, 19(1).</w:t>
+        <w:t xml:space="preserve">Granovetter, M. (1985) ‘Economic action and social structure: the problem of embeddedness’, American Journal of Sociology, 91(3).</w:t>
       </w:r>
     </w:p>
     <w:p>
@@ -10080,7 +10080,7 @@
           <w:sz w:val="21"/>
           <w:szCs w:val="21"/>
         </w:rPr>
-        <w:t xml:space="preserve">Hofstede, G., Hofstede, G.J. and Minkov, M. (2010) Cultures and Organizations: Software of the Mind. 3rd edn.</w:t>
+        <w:t xml:space="preserve">Teece, D.J. (2007) ‘Explicating dynamic capabilities: the nature and microfoundations of (sustainable) enterprise performance’, Strategic Management Journal, 28(13).</w:t>
       </w:r>
     </w:p>
     <w:p>
@@ -10098,7 +10098,7 @@
           <w:sz w:val="21"/>
           <w:szCs w:val="21"/>
         </w:rPr>
-        <w:t xml:space="preserve">Johanson, J. and Vahlne, J-E. (2009) ‘The Uppsala internationalization process model revisited: from liability of foreignness to liability of outsidership’, Journal of International Business Studies, 40(9).</w:t>
+        <w:t xml:space="preserve">Hofstede, G., Hofstede, G.J. and Minkov, M. (2010) Cultures and Organizations: Software of the Mind. 3rd edn.</w:t>
       </w:r>
     </w:p>
     <w:p>
@@ -10135,60 +10135,6 @@
           <w:szCs w:val="21"/>
         </w:rPr>
         <w:t xml:space="preserve">Lieberman, M.B. and Montgomery, D.B. (1988) ‘First-mover advantages’, Strategic Management Journal, 9(S1).</w:t>
-      </w:r>
-    </w:p>
-    <w:p>
-      <w:pPr>
-        <w:pStyle w:val="ListParagraph"/>
-        <w:numPr>
-          <w:ilvl w:val="0"/>
-          <w:numId w:val="2"/>
-        </w:numPr>
-        <w:spacing w:after="60"/>
-      </w:pPr>
-      <w:r>
-        <w:rPr>
-          <w:rFonts w:ascii="Calibri" w:cs="Calibri" w:eastAsia="Calibri" w:hAnsi="Calibri"/>
-          <w:sz w:val="21"/>
-          <w:szCs w:val="21"/>
-        </w:rPr>
-        <w:t xml:space="preserve">Prahalad, C.K. and Hamel, G. (1990) ‘The core competence of the corporation’, Harvard Business Review, 68(3).</w:t>
-      </w:r>
-    </w:p>
-    <w:p>
-      <w:pPr>
-        <w:pStyle w:val="ListParagraph"/>
-        <w:numPr>
-          <w:ilvl w:val="0"/>
-          <w:numId w:val="2"/>
-        </w:numPr>
-        <w:spacing w:after="60"/>
-      </w:pPr>
-      <w:r>
-        <w:rPr>
-          <w:rFonts w:ascii="Calibri" w:cs="Calibri" w:eastAsia="Calibri" w:hAnsi="Calibri"/>
-          <w:sz w:val="21"/>
-          <w:szCs w:val="21"/>
-        </w:rPr>
-        <w:t xml:space="preserve">Scott, W.R. (2014) Institutions and Organizations. 4th edn.</w:t>
-      </w:r>
-    </w:p>
-    <w:p>
-      <w:pPr>
-        <w:pStyle w:val="ListParagraph"/>
-        <w:numPr>
-          <w:ilvl w:val="0"/>
-          <w:numId w:val="2"/>
-        </w:numPr>
-        <w:spacing w:after="60"/>
-      </w:pPr>
-      <w:r>
-        <w:rPr>
-          <w:rFonts w:ascii="Calibri" w:cs="Calibri" w:eastAsia="Calibri" w:hAnsi="Calibri"/>
-          <w:sz w:val="21"/>
-          <w:szCs w:val="21"/>
-        </w:rPr>
-        <w:t xml:space="preserve">Teece, D.J., Pisano, G. and Shuen, A. (1997) ‘Dynamic capabilities and strategic management’, Strategic Management Journal, 18(7).</w:t>
       </w:r>
     </w:p>
     <w:p>
@@ -10532,7 +10478,7 @@
         </w:numPr>
         <w:spacing w:after="40"/>
       </w:pPr>
-      <w:hyperlink w:history="1" r:id="rIdpfuxypcqpfddgcovidced">
+      <w:hyperlink w:history="1" r:id="rId7ijsjjklh74sbmsnzl76d">
         <w:r>
           <w:rPr>
             <w:rStyle w:val="Hyperlink"/>
@@ -10553,7 +10499,7 @@
         </w:numPr>
         <w:spacing w:after="40"/>
       </w:pPr>
-      <w:hyperlink w:history="1" r:id="rIdvotzrz7rsgspczsskl7uj">
+      <w:hyperlink w:history="1" r:id="rIdomvlmivtorvzxudtuukca">
         <w:r>
           <w:rPr>
             <w:rStyle w:val="Hyperlink"/>
@@ -10574,7 +10520,7 @@
         </w:numPr>
         <w:spacing w:after="40"/>
       </w:pPr>
-      <w:hyperlink w:history="1" r:id="rIdg8xny_kn7abmdsjtxpsci">
+      <w:hyperlink w:history="1" r:id="rId5fmvjyzk518skl9dowbsy">
         <w:r>
           <w:rPr>
             <w:rStyle w:val="Hyperlink"/>
@@ -10595,7 +10541,7 @@
         </w:numPr>
         <w:spacing w:after="40"/>
       </w:pPr>
-      <w:hyperlink w:history="1" r:id="rId0i5hkxstw2rs6kzbyyf1o">
+      <w:hyperlink w:history="1" r:id="rIdljn30dv8oug39fnehdajt">
         <w:r>
           <w:rPr>
             <w:rStyle w:val="Hyperlink"/>
@@ -10616,7 +10562,7 @@
         </w:numPr>
         <w:spacing w:after="40"/>
       </w:pPr>
-      <w:hyperlink w:history="1" r:id="rIdzblp5gcmq7mgqevghn5ru">
+      <w:hyperlink w:history="1" r:id="rIdygrrkhj_ws55md1miffgw">
         <w:r>
           <w:rPr>
             <w:rStyle w:val="Hyperlink"/>
@@ -10637,7 +10583,7 @@
         </w:numPr>
         <w:spacing w:after="40"/>
       </w:pPr>
-      <w:hyperlink w:history="1" r:id="rId4pxcbkh70hdcwkeymcsql">
+      <w:hyperlink w:history="1" r:id="rIdd6uiy9crza9ipqiv3xtv5">
         <w:r>
           <w:rPr>
             <w:rStyle w:val="Hyperlink"/>
@@ -10658,7 +10604,7 @@
         </w:numPr>
         <w:spacing w:after="40"/>
       </w:pPr>
-      <w:hyperlink w:history="1" r:id="rIdkkmef0xd6qnuinmxetyt2">
+      <w:hyperlink w:history="1" r:id="rIdv1yb7hel2owp00lrcuqmq">
         <w:r>
           <w:rPr>
             <w:rStyle w:val="Hyperlink"/>
@@ -10679,7 +10625,7 @@
         </w:numPr>
         <w:spacing w:after="40"/>
       </w:pPr>
-      <w:hyperlink w:history="1" r:id="rIdvdik0egveglfnb0yl-vtb">
+      <w:hyperlink w:history="1" r:id="rIdrjra8j1dcqnuemrgdrg_0">
         <w:r>
           <w:rPr>
             <w:rStyle w:val="Hyperlink"/>
@@ -10700,7 +10646,7 @@
         </w:numPr>
         <w:spacing w:after="40"/>
       </w:pPr>
-      <w:hyperlink w:history="1" r:id="rIdan3nqomt9cabkgjnulu-w">
+      <w:hyperlink w:history="1" r:id="rId4d9ysdxelflaguyxsxkdx">
         <w:r>
           <w:rPr>
             <w:rStyle w:val="Hyperlink"/>
@@ -10721,7 +10667,7 @@
         </w:numPr>
         <w:spacing w:after="40"/>
       </w:pPr>
-      <w:hyperlink w:history="1" r:id="rId4eepksjl377bkg7nkaqk4">
+      <w:hyperlink w:history="1" r:id="rId1-skyz1szyxslmyi9b6uo">
         <w:r>
           <w:rPr>
             <w:rStyle w:val="Hyperlink"/>
@@ -10742,7 +10688,7 @@
         </w:numPr>
         <w:spacing w:after="40"/>
       </w:pPr>
-      <w:hyperlink w:history="1" r:id="rIdy2ovikgdrh3komheqv-sy">
+      <w:hyperlink w:history="1" r:id="rId8qf0_kmbbfruwmu0-tv6v">
         <w:r>
           <w:rPr>
             <w:rStyle w:val="Hyperlink"/>
@@ -10763,7 +10709,7 @@
         </w:numPr>
         <w:spacing w:after="40"/>
       </w:pPr>
-      <w:hyperlink w:history="1" r:id="rIdcz10lgvvtdjmc-gbr2vcb">
+      <w:hyperlink w:history="1" r:id="rIdcv_bluuawiq_smatyocwj">
         <w:r>
           <w:rPr>
             <w:rStyle w:val="Hyperlink"/>
@@ -10784,7 +10730,7 @@
         </w:numPr>
         <w:spacing w:after="40"/>
       </w:pPr>
-      <w:hyperlink w:history="1" r:id="rIdc79recniiokqwcpgjqpnj">
+      <w:hyperlink w:history="1" r:id="rIdrnci1u8lapilyfcdjs_aj">
         <w:r>
           <w:rPr>
             <w:rStyle w:val="Hyperlink"/>
@@ -10805,7 +10751,7 @@
         </w:numPr>
         <w:spacing w:after="40"/>
       </w:pPr>
-      <w:hyperlink w:history="1" r:id="rId6og_8nyibsess_h54jhfz">
+      <w:hyperlink w:history="1" r:id="rIdn-d_xjsromhxjfnsc0wzn">
         <w:r>
           <w:rPr>
             <w:rStyle w:val="Hyperlink"/>

</xml_diff>